<commit_message>
feat: implement REST API, database schema, RBAC and AI service
Backend for ServiceDesk AI.

- PostgreSQL schema with 8 tables, enums, constraints and indexes,
  applied by numbered SQL migrations
- JWT authentication with bcrypt hashing and refresh cookies
- Two-layer RBAC: route role middleware plus record ownership checks
- Ticket CRUD, guarded lifecycle transitions, assignment and threading
- Search, filtering and pagination backed by a GIN full-text index
- Role-specific dashboards and reports computed from live data
- AI service with provider adapter and deterministic rule-based fallback
- Notifications and audit logging
- 92 tests covering auth, authorisation, tickets and AI degradation
</commit_message>
<xml_diff>
--- a/docs/Report_Cover_Page.docx
+++ b/docs/Report_Cover_Page.docx
@@ -507,7 +507,7 @@
     </w:p>
     <w:p>
       <w:pPr>
-        <w:spacing w:after="80" w:line="276"/>
+        <w:spacing w:after="360" w:line="276"/>
         <w:jc w:val="center"/>
       </w:pPr>
       <w:r>
@@ -520,25 +520,7 @@
           <w:sz w:val="23"/>
           <w:szCs w:val="23"/>
         </w:rPr>
-        <w:t xml:space="preserve">B.Tech. Electronics and Communication Engineering</w:t>
-      </w:r>
-    </w:p>
-    <w:p>
-      <w:pPr>
-        <w:spacing w:after="360" w:line="276"/>
-        <w:jc w:val="center"/>
-      </w:pPr>
-      <w:r>
-        <w:rPr>
-          <w:rFonts w:ascii="Calibri" w:cs="Calibri" w:eastAsia="Calibri" w:hAnsi="Calibri"/>
-          <w:b w:val="false"/>
-          <w:bCs w:val="false"/>
-          <w:caps w:val="false"/>
-          <w:color w:val="4A4A4A"/>
-          <w:sz w:val="21"/>
-          <w:szCs w:val="21"/>
-        </w:rPr>
-        <w:t xml:space="preserve">Sixth Semester</w:t>
+        <w:t xml:space="preserve">B.Tech. Electronics and Computer Engineering</w:t>
       </w:r>
     </w:p>
     <w:p>
@@ -587,7 +569,7 @@
           <w:sz w:val="26"/>
           <w:szCs w:val="26"/>
         </w:rPr>
-        <w:t xml:space="preserve">[ Faculty Name ]</w:t>
+        <w:t xml:space="preserve">Dr. M Dinakaran</w:t>
       </w:r>
     </w:p>
     <w:p>

</xml_diff>